<commit_message>
Address grader critique: align text with screenshots, BCNF justification, and telemetry
</commit_message>
<xml_diff>
--- a/24BCE1503-DA3-HotelManagement_Report.docx
+++ b/24BCE1503-DA3-HotelManagement_Report.docx
@@ -561,7 +561,7 @@
         <w:rPr>
           <w:b/>
         </w:rPr>
-        <w:t>7</w:t>
+        <w:t>8</w:t>
       </w:r>
     </w:p>
     <w:p>
@@ -584,7 +584,7 @@
         <w:rPr>
           <w:b/>
         </w:rPr>
-        <w:t>8</w:t>
+        <w:t>9</w:t>
       </w:r>
     </w:p>
     <w:p>
@@ -607,7 +607,7 @@
         <w:rPr>
           <w:b/>
         </w:rPr>
-        <w:t>8</w:t>
+        <w:t>9</w:t>
       </w:r>
     </w:p>
     <w:p>
@@ -653,7 +653,7 @@
         <w:rPr>
           <w:b/>
         </w:rPr>
-        <w:t>9</w:t>
+        <w:t>10</w:t>
       </w:r>
     </w:p>
     <w:p>
@@ -699,7 +699,7 @@
         <w:rPr>
           <w:b/>
         </w:rPr>
-        <w:t>10</w:t>
+        <w:t>11</w:t>
       </w:r>
     </w:p>
     <w:p>
@@ -1023,17 +1023,17 @@
     </w:p>
     <w:p>
       <w:r>
-        <w:t>This report details the architectural design, implementation, and cloud deployment of HotelStay, a full-stack, cloud-native Hotel Management System developed as the DA3 project at Vellore Institute of Technology, Chennai. The system provides an end-to-end operational platform for hospitality management, covering guest profiling, dynamic room inventory, reservation lifecycles, and billing settlement. The application is architectured as a multi-tier solution deployed on an Amazon Elastic Compute Cloud (Amazon EC2) virtual server running Ubuntu Linux.</w:t>
+        <w:t>This report details the architectural design, implementation, and cloud deployment of HotelStay, a full-stack, cloud-native Hotel Management System developed as the DA3 project at Vellore Institute of Technology, Chennai. The system provides an end-to-end operational platform for hospitality management, covering guest profiling, dynamic room inventory, reservation lifecycles, and billing settlement. The application is architectured as a multi-tier solution deployed on an Amazon Elastic Compute Cloud (Amazon EC2) virtual server running Ubuntu Linux in the ap-south-1 (Mumbai) region.</w:t>
       </w:r>
     </w:p>
     <w:p>
       <w:r>
-        <w:t>The frontend presentation tier is built with React 18 and bundled using Vite, served through a high-performance Nginx web server that acts as a reverse proxy on HTTP port 80. The application tier comprises a custom Java 17 REST API server utilizing raw Java Database Connectivity (JDBC) with parameterized queries for deterministic, high-throughput execution without enterprise framework overhead. The persistence tier is powered by MySQL 8.0, adhering strictly to Boyce-Codd Normal Form (BCNF) across 13 relational entities, reinforced with foreign key referential integrity, domain constraints (CHECK), cascading updates/deletes, and relational database views (vw_booking_details).</w:t>
+        <w:t>The frontend presentation tier is built with React 18 and bundled using Vite, served through a high-performance Nginx web server acting as a reverse proxy on HTTP port 80. The application tier comprises a custom Java 17 REST API server utilizing raw Java Database Connectivity (JDBC) with parameterized queries for deterministic, high-throughput execution without enterprise framework overhead. The persistence tier is powered by MySQL 8.0, adhering strictly to Boyce-Codd Normal Form (BCNF) across 13 relational entities, reinforced with foreign key referential integrity, domain constraints (CHECK), cascading actions, and relational database views (vw_booking_details).</w:t>
       </w:r>
     </w:p>
     <w:p>
       <w:r>
-        <w:t>All tiers are orchestrated using Docker and Docker Compose, isolating database and backend communication within an internal container network, eliminating Cross-Origin Resource Sharing (CORS) vulnerabilities. Operational resilience is ensured on AWS Free-Tier compute through an automated 512MB virtual memory swap configuration and Amazon CloudWatch performance monitoring.</w:t>
+        <w:t>All tiers are containerized and orchestrated using Docker and Docker Compose. Nginx acts as the single public gateway on port 80, eliminating Cross-Origin Resource Sharing (CORS) complexity and proxying API traffic internally to the backend. Operational resilience on AWS Free-Tier compute is ensured through an automated 512MB virtual memory swap configuration and integrated Amazon CloudWatch telemetry monitoring.</w:t>
       </w:r>
     </w:p>
     <w:p>
@@ -1063,7 +1063,7 @@
     </w:p>
     <w:p>
       <w:r>
-        <w:t>The core database design enforces complete Boyce-Codd Normal Form (BCNF) normalization to eliminate data insertion, update, and deletion anomalies. By combining this normalized schema with a lightweight, containerized micro-architecture on Amazon EC2, the system achieves sub-second response times, zero CORS configuration complexity, and cost-effective operation fully within the AWS Free Tier.</w:t>
+        <w:t>The core database design enforces Boyce-Codd Normal Form (BCNF) normalization to eliminate data insertion, update, and deletion anomalies. By combining this normalized schema with a lightweight, containerized micro-architecture on Amazon EC2, the system achieves responsive sub-second page rendering, zero CORS configuration complexity, and cost-effective operation within the AWS Free Tier.</w:t>
       </w:r>
     </w:p>
     <w:p>
@@ -1153,7 +1153,7 @@
         <w:t>Containerized Multi-Tier Orchestration:</w:t>
       </w:r>
       <w:r>
-        <w:t xml:space="preserve"> Containerize the React frontend, Java backend, and MySQL database using multi-stage Dockerfile definitions and orchestrate their lifecycle via docker-compose.yml.</w:t>
+        <w:t xml:space="preserve"> Containerize the React frontend, Java backend, and MySQL database using multi-stage Dockerfile definitions and orchestrate their lifecycle via Docker Compose.</w:t>
       </w:r>
     </w:p>
     <w:p>
@@ -1198,7 +1198,7 @@
         <w:t>Cloud Observability:</w:t>
       </w:r>
       <w:r>
-        <w:t xml:space="preserve"> Monitor CPU utilization, network traffic, and system logs through Amazon CloudWatch and container health checks.</w:t>
+        <w:t xml:space="preserve"> Monitor CPU utilization, network traffic, and system logs through integrated Amazon CloudWatch telemetry and container health checks.</w:t>
       </w:r>
     </w:p>
     <w:p>
@@ -1223,7 +1223,7 @@
     </w:p>
     <w:p>
       <w:r>
-        <w:t>The application implements a decoupled, three-tier cloud architecture hosted on an Amazon EC2 virtual server. The architecture isolates public-facing presentation components from internal application and database services via Docker bridge networking.</w:t>
+        <w:t>The application implements a decoupled, three-tier cloud architecture hosted on an Amazon EC2 virtual server (t3.micro). The architecture separates public-facing presentation components from internal application and database services through container network abstraction and AWS security group firewalls.</w:t>
       </w:r>
     </w:p>
     <w:tbl>
@@ -1315,7 +1315,7 @@
                 <w:b/>
                 <w:color w:val="FFFFFF"/>
               </w:rPr>
-              <w:t>Responsibilities</w:t>
+              <w:t>Responsibilities &amp; Network Exposure</w:t>
             </w:r>
           </w:p>
         </w:tc>
@@ -1385,7 +1385,7 @@
               <w:rPr>
                 <w:sz w:val="19"/>
               </w:rPr>
-              <w:t>Delivers responsive UI; manages client routing; proxies /api/* requests to backend container; handles gzip compression.</w:t>
+              <w:t>Serves client SPA on HTTP Port 80; reverse-proxies /api/* requests to backend container; handles gzip compression. Publicly exposed to 0.0.0.0/0.</w:t>
             </w:r>
           </w:p>
         </w:tc>
@@ -1451,7 +1451,7 @@
               <w:rPr>
                 <w:sz w:val="19"/>
               </w:rPr>
-              <w:t>Executes business logic; handles HTTP endpoints; coordinates database transactions; performs input sanitization.</w:t>
+              <w:t>Executes business logic and JDBC queries; bound to host port 8080 for direct container diagnostics, but shielded from external internet ingress by the AWS Security Group.</w:t>
             </w:r>
           </w:p>
         </w:tc>
@@ -1521,7 +1521,7 @@
               <w:rPr>
                 <w:sz w:val="19"/>
               </w:rPr>
-              <w:t>Enforces referential integrity; maintains transactional ACID guarantees; runs BCNF relations, views, and indexes.</w:t>
+              <w:t>Maintains transactional ACID guarantees; enforces BCNF relations, views, and indexes. Bound exclusively to 127.0.0.1 (loopback), completely inaccessible to public internet.</w:t>
             </w:r>
           </w:p>
         </w:tc>
@@ -1587,12 +1587,26 @@
               <w:rPr>
                 <w:sz w:val="19"/>
               </w:rPr>
-              <w:t>Virtual server host; provides Linux kernel namespaces; maintains swap space; enforces AWS Security Group firewall.</w:t>
+              <w:t>Virtual server host; provides Linux kernel namespaces; maintains 512MB swap space; enforces AWS Security Group firewall perimeter.</w:t>
             </w:r>
           </w:p>
         </w:tc>
       </w:tr>
     </w:tbl>
+    <w:p/>
+    <w:p>
+      <w:r>
+        <w:t>Network Ingress &amp; Defense-in-Depth Model:</w:t>
+        <w:br/>
+        <w:t>1. External traffic enters exclusively through standard HTTP Port 80 managed by Nginx.</w:t>
+        <w:br/>
+        <w:t>2. The Nginx reverse proxy routes client requests for / to the compiled static assets and proxies /api/* requests internally to the Java backend (hotel_backend:8080) over the Docker bridge network (app_default).</w:t>
+        <w:br/>
+        <w:t>3. While host port 8080 is published for developer diagnosis on the EC2 machine, the external AWS Security Group (launch-wizard-1) does not permit port 8080 inbound from the internet, ensuring defense-in-depth.</w:t>
+        <w:br/>
+        <w:t>4. MySQL is bound strictly to the host loopback interface (127.0.0.1:3306), ensuring that external network packets cannot reach the persistence layer directly.</w:t>
+      </w:r>
+    </w:p>
     <w:p>
       <w:pPr>
         <w:keepNext/>
@@ -1731,7 +1745,7 @@
               <w:rPr>
                 <w:sz w:val="19"/>
               </w:rPr>
-              <w:t>Provides scalable virtual compute host for running containerized services within the AWS Free Tier.</w:t>
+              <w:t>Provides scalable virtual compute host for running containerized services within the AWS Free Tier (ap-south-1).</w:t>
             </w:r>
           </w:p>
         </w:tc>
@@ -1781,7 +1795,7 @@
               <w:rPr>
                 <w:sz w:val="19"/>
               </w:rPr>
-              <w:t>Provides logical network isolation, public subnets, and routing table configuration for the host instance.</w:t>
+              <w:t>Provides logical network isolation, public subnets (subnet-0ccec48796ac7db5d), and internet gateway routing.</w:t>
             </w:r>
           </w:p>
         </w:tc>
@@ -1834,7 +1848,7 @@
               <w:rPr>
                 <w:sz w:val="19"/>
               </w:rPr>
-              <w:t>Acts as virtual firewall: allows inbound HTTP (Port 80) from 0.0.0.0/0 and SSH (Port 22) for administration.</w:t>
+              <w:t>Stateful virtual firewall: permits inbound HTTP (Port 80) and SSH (Port 22); includes inherited Port 1433 rule from initial launch template.</w:t>
             </w:r>
           </w:p>
         </w:tc>
@@ -1884,7 +1898,7 @@
               <w:rPr>
                 <w:sz w:val="19"/>
               </w:rPr>
-              <w:t>Provides persistent block-level root storage for the OS, container images, and MySQL database volume.</w:t>
+              <w:t>Provides persistent block-level root storage for the OS, container images, and MySQL database named volume (db_data).</w:t>
             </w:r>
           </w:p>
         </w:tc>
@@ -1920,7 +1934,7 @@
               <w:rPr>
                 <w:sz w:val="19"/>
               </w:rPr>
-              <w:t>EC2 System Metrics (AWS/EC2)</w:t>
+              <w:t>EC2 Console Monitoring (AWS/EC2)</w:t>
             </w:r>
           </w:p>
         </w:tc>
@@ -1937,7 +1951,7 @@
               <w:rPr>
                 <w:sz w:val="19"/>
               </w:rPr>
-              <w:t>Real-time monitoring of CPU utilization, network traffic (bytes in/out), and disk operations at 1-minute granularity.</w:t>
+              <w:t>Integrated telemetry tracking CPU utilization (%), network in/out throughput, packet counts, and T3 CPU burst credit consumption.</w:t>
             </w:r>
           </w:p>
         </w:tc>
@@ -2023,7 +2037,7 @@
               <w:rPr>
                 <w:sz w:val="19"/>
               </w:rPr>
-              <w:t>Compose Specification v3.8</w:t>
+              <w:t>Compose Specification (V2)</w:t>
             </w:r>
           </w:p>
         </w:tc>
@@ -2040,7 +2054,7 @@
               <w:rPr>
                 <w:sz w:val="19"/>
               </w:rPr>
-              <w:t>Orchestrates multi-container networking, dependencies, persistent volume mounting, and health checks.</w:t>
+              <w:t>Orchestrates multi-container networking, dependencies, persistent volume mounting, and container health checks.</w:t>
             </w:r>
           </w:p>
         </w:tc>
@@ -2090,7 +2104,7 @@
               <w:rPr>
                 <w:sz w:val="19"/>
               </w:rPr>
-              <w:t>Augments physical RAM of Free-Tier EC2 instance, preventing Out-Of-Memory compilation aborts.</w:t>
+              <w:t>Augments physical RAM of Free-Tier EC2 instance, preventing Out-Of-Memory (OOM) build failures.</w:t>
             </w:r>
           </w:p>
         </w:tc>
@@ -2118,7 +2132,7 @@
     </w:p>
     <w:p>
       <w:r>
-        <w:t>The persistence tier is built upon a rigorously structured 13-table relational schema designed to satisfy Boyce-Codd Normal Form (BCNF). Every non-trivial functional dependency X -&gt; Y has X as a superkey, completely eliminating data insertion, update, and deletion anomalies.</w:t>
+        <w:t>The persistence tier is built upon a rigorously structured 13-table relational schema designed to satisfy Boyce-Codd Normal Form (BCNF). A relation R is in BCNF if and only if for every non-trivial functional dependency X -&gt; Y, X is a superkey of R. This design systematically eliminates insertion, update, and deletion anomalies.</w:t>
       </w:r>
     </w:p>
     <w:tbl>
@@ -2280,7 +2294,7 @@
               <w:rPr>
                 <w:sz w:val="19"/>
               </w:rPr>
-              <w:t>Pin_no -&gt; City, State (BCNF Location decomposition)</w:t>
+              <w:t>Pin_no -&gt; City, State (BCNF decomposition eliminating transitive dependency from Employee)</w:t>
             </w:r>
           </w:p>
         </w:tc>
@@ -2346,7 +2360,7 @@
               <w:rPr>
                 <w:sz w:val="19"/>
               </w:rPr>
-              <w:t>G_ID -&gt; All attributes; Mob_No unique constraint</w:t>
+              <w:t>G_ID -&gt; All attributes; Candidate Key: Mob_No -&gt; G_ID (both superkeys)</w:t>
             </w:r>
           </w:p>
         </w:tc>
@@ -2416,7 +2430,7 @@
               <w:rPr>
                 <w:sz w:val="19"/>
               </w:rPr>
-              <w:t>E_ID -&gt; All attributes; FK to ZipCode</w:t>
+              <w:t>E_ID -&gt; All attributes; Foreign Key to ZipCode(Pin_no)</w:t>
             </w:r>
           </w:p>
         </w:tc>
@@ -2482,7 +2496,7 @@
               <w:rPr>
                 <w:sz w:val="19"/>
               </w:rPr>
-              <w:t>R_ID -&gt; All attributes; Status: Available/Occupied</w:t>
+              <w:t>R_ID -&gt; All attributes; Status CHECK (Available, Occupied)</w:t>
             </w:r>
           </w:p>
         </w:tc>
@@ -2552,7 +2566,7 @@
               <w:rPr>
                 <w:sz w:val="19"/>
               </w:rPr>
-              <w:t>E_ID -&gt; Dept_Managed, Allowance; 1:1 FK to Employee</w:t>
+              <w:t>E_ID -&gt; Dept_Managed, Allowance; 1:1 Specialization FK to Employee</w:t>
             </w:r>
           </w:p>
         </w:tc>
@@ -2618,7 +2632,7 @@
               <w:rPr>
                 <w:sz w:val="19"/>
               </w:rPr>
-              <w:t>E_ID -&gt; Shift, Overtime_Hours; 1:1 FK to Employee</w:t>
+              <w:t>E_ID -&gt; Shift, Overtime_Hours; 1:1 Specialization FK to Employee</w:t>
             </w:r>
           </w:p>
         </w:tc>
@@ -2688,7 +2702,7 @@
               <w:rPr>
                 <w:sz w:val="19"/>
               </w:rPr>
-              <w:t>E_ID -&gt; Counter_No, Languages; 1:1 FK to Employee</w:t>
+              <w:t>E_ID -&gt; Counter_No, Languages; 1:1 Specialization FK to Employee</w:t>
             </w:r>
           </w:p>
         </w:tc>
@@ -2738,7 +2752,7 @@
               <w:rPr>
                 <w:sz w:val="19"/>
               </w:rPr>
-              <w:t>Booking_ID, Check_In, Check_Out, Total_Amount, G_ID, R_ID</w:t>
+              <w:t>Booking_ID, Check_In, Check_Out, Total_Amount, G_ID, R_ID, Booking_Type, Status</w:t>
             </w:r>
           </w:p>
         </w:tc>
@@ -2754,7 +2768,7 @@
               <w:rPr>
                 <w:sz w:val="19"/>
               </w:rPr>
-              <w:t>Booking_ID -&gt; All; FK to Guest(G_ID) and Room(R_ID)</w:t>
+              <w:t>Booking_ID -&gt; All; FK to Guest(G_ID) and Room(R_ID); temporal amount snapshot</w:t>
             </w:r>
           </w:p>
         </w:tc>
@@ -2824,7 +2838,7 @@
               <w:rPr>
                 <w:sz w:val="19"/>
               </w:rPr>
-              <w:t>B_ID -&gt; All; FK to Booking_Record(Booking_ID)</w:t>
+              <w:t>B_ID -&gt; All; FK to Booking_Record(Booking_ID); Status: Unpaid/Paid</w:t>
             </w:r>
           </w:p>
         </w:tc>
@@ -2890,7 +2904,7 @@
               <w:rPr>
                 <w:sz w:val="19"/>
               </w:rPr>
-              <w:t>Record_no -&gt; All; Operational audit logging</w:t>
+              <w:t>Record_no -&gt; All; Operational audit logging entity</w:t>
             </w:r>
           </w:p>
         </w:tc>
@@ -2960,7 +2974,7 @@
               <w:rPr>
                 <w:sz w:val="19"/>
               </w:rPr>
-              <w:t>Composite PK; Tracks room maintenance assignments</w:t>
+              <w:t>(E_ID, R_ID) -&gt; All; M:N relationship junction table</w:t>
             </w:r>
           </w:p>
         </w:tc>
@@ -3026,7 +3040,7 @@
               <w:rPr>
                 <w:sz w:val="19"/>
               </w:rPr>
-              <w:t>Composite PK; VIP guest to executive manager mapping</w:t>
+              <w:t>(G_ID, E_ID) -&gt; All; VIP guest executive assignment junction table</w:t>
             </w:r>
           </w:p>
         </w:tc>
@@ -3096,12 +3110,47 @@
               <w:rPr>
                 <w:sz w:val="19"/>
               </w:rPr>
-              <w:t>Composite PK; Staff audit logging operations</w:t>
+              <w:t>(E_ID, Record_no) -&gt; All; Audit trail junction table</w:t>
             </w:r>
           </w:p>
         </w:tc>
       </w:tr>
     </w:tbl>
+    <w:p/>
+    <w:p>
+      <w:pPr>
+        <w:keepNext/>
+        <w:spacing w:before="200" w:after="40"/>
+      </w:pPr>
+      <w:r>
+        <w:rPr>
+          <w:rFonts w:ascii="Calibri" w:hAnsi="Calibri"/>
+          <w:b/>
+          <w:color w:val="2E75B6"/>
+          <w:sz w:val="24"/>
+        </w:rPr>
+        <w:t>BCNF Decomposition &amp; Functional Dependency Analysis</w:t>
+      </w:r>
+    </w:p>
+    <w:p>
+      <w:r>
+        <w:t>1. Elimination of Transitive Dependencies via ZipCode: In standard staff management tables, storing City and State alongside Employee would introduce the dependency E_ID -&gt; Pin_no and Pin_no -&gt; City, State, violating BCNF because Pin_no is not a superkey of Employee. By decomposing this into a dedicated ZipCode(Pin_no, City, State) relation where Pin_no is the primary key (and superkey), the schema satisfies BCNF.</w:t>
+        <w:br/>
+        <w:br/>
+        <w:t>2. Justification of Total_Amount in Booking_Record (Temporal Immutability): Relational purity might suggest that Total_Amount is a derived attribute (Price_Per_Night * Nights). However, in enterprise hospitality management, storing Total_Amount upon booking creation is a deliberate, standardized temporal snapshot pattern. Hotel room tariffs (Price_Per_Night in Room) change frequently due to seasonality, promotions, and inflation. If Total_Amount were dynamically derived from the current Room table, any tariff update would retroactively alter past financial receipts, violating accounting integrity. Under temporal functional dependencies, Total_Amount is determined uniquely by the booking transaction at that specific point in time: Booking_ID -&gt; Total_Amount. Since Booking_ID is the candidate key and superkey, BCNF is strictly preserved.</w:t>
+        <w:br/>
+        <w:br/>
+        <w:t>3. Single-Inheritance Specialization: Role tables (Manager, Housekeeper, Receptionist) share primary key E_ID with Employee. The functional dependency E_ID -&gt; attributes holds with E_ID being the unique primary key, adhering to BCNF.</w:t>
+        <w:br/>
+        <w:br/>
+        <w:t>4. Junction Relations: Tables Housekeeper_Room, Guest_Manager, and Receptionist_Records possess composite keys with no non-key attributes or dependencies other than the full key, satisfying BCNF trivially.</w:t>
+      </w:r>
+    </w:p>
+    <w:p>
+      <w:r>
+        <w:br w:type="page"/>
+      </w:r>
+    </w:p>
     <w:p>
       <w:pPr>
         <w:keepNext/>
@@ -3126,10 +3175,10 @@
         <w:rPr>
           <w:b/>
         </w:rPr>
-        <w:t>7.1 Real-Time Analytics &amp; Live Status:</w:t>
+        <w:t>7.1 Real-Time System Status &amp; Header:</w:t>
       </w:r>
       <w:r>
-        <w:t xml:space="preserve"> Operator details (Pranav Jahagirdar • Reception) and live health badge (DB: UP) dynamically reflecting MySQL connectivity.</w:t>
+        <w:t xml:space="preserve"> Operator identification (Pranav Jahagirdar • Reception) and live health badge (DB: UP) dynamically reflecting MySQL connectivity over JDBC.</w:t>
       </w:r>
     </w:p>
     <w:p>
@@ -3141,10 +3190,10 @@
         <w:rPr>
           <w:b/>
         </w:rPr>
-        <w:t>7.2 Guest Management &amp; Profiling:</w:t>
+        <w:t>7.2 Guest Registration &amp; Contact Validation:</w:t>
       </w:r>
       <w:r>
-        <w:t xml:space="preserve"> Transactional data entry module supporting guest insertion with regex validation for contact numbers (10–15 digits) and date formats.</w:t>
+        <w:t xml:space="preserve"> Form module supporting guest insertion with format constraints for 10–15 digit contact numbers, date of birth, and gender.</w:t>
       </w:r>
     </w:p>
     <w:p>
@@ -3156,10 +3205,10 @@
         <w:rPr>
           <w:b/>
         </w:rPr>
-        <w:t>7.3 Room Inventory &amp; Availability:</w:t>
+        <w:t>7.3 Room Inventory Management:</w:t>
       </w:r>
       <w:r>
-        <w:t xml:space="preserve"> Room categorization (Single, Double, Deluxe, Suite) with nightly tariffs and real-time status (Available, Occupied).</w:t>
+        <w:t xml:space="preserve"> Room creation form supporting room types (Single, Double, Deluxe, Suite), capacity specification, nightly tariffs, and initial availability.</w:t>
       </w:r>
     </w:p>
     <w:p>
@@ -3171,10 +3220,10 @@
         <w:rPr>
           <w:b/>
         </w:rPr>
-        <w:t>7.4 Multi-Table Filtered Retrieval:</w:t>
+        <w:t>7.4 Reservation &amp; Booking Allocation:</w:t>
       </w:r>
       <w:r>
-        <w:t xml:space="preserve"> Interactive search view executing real-time WHERE filtering across arrival dates, room types, booking channels, and guest names, featuring live SQL query display.</w:t>
+        <w:t xml:space="preserve"> Form module linking registered guests and rooms with booking types (Walk-in, Online, Phone, Agent) and reservation statuses (Confirmed, Checked-in, Pending).</w:t>
       </w:r>
     </w:p>
     <w:p>
@@ -3189,7 +3238,7 @@
         <w:t>7.5 Billing &amp; Invoicing Settlement:</w:t>
       </w:r>
       <w:r>
-        <w:t xml:space="preserve"> Invoice generation tied to reservations with financial tracking for amounts and payment statuses (Paid, Pending).</w:t>
+        <w:t xml:space="preserve"> Add Bill form linking financial settlement to guests and active bookings with amount input and status tracking (Unpaid / Paid).</w:t>
       </w:r>
     </w:p>
     <w:p>
@@ -3201,10 +3250,25 @@
         <w:rPr>
           <w:b/>
         </w:rPr>
-        <w:t>7.6 System Health Diagnostic:</w:t>
+        <w:t>7.6 Multi-Table Filtered Retrieval:</w:t>
       </w:r>
       <w:r>
-        <w:t xml:space="preserve"> Dedicated /api/health endpoint verifying live JDBC database pool connectivity and reporting HTTP 200 JSON status.</w:t>
+        <w:t xml:space="preserve"> Interactive search tab executing multi-criteria WHERE queries against the vw_booking_details SQL view, supporting arrival date, room type, booking type, and status filtering with live SQL syntax display.</w:t>
+      </w:r>
+    </w:p>
+    <w:p>
+      <w:pPr>
+        <w:pStyle w:val="ListBullet"/>
+        <w:spacing w:after="60"/>
+      </w:pPr>
+      <w:r>
+        <w:rPr>
+          <w:b/>
+        </w:rPr>
+        <w:t>7.7 Diagnostic Health Endpoint:</w:t>
+      </w:r>
+      <w:r>
+        <w:t xml:space="preserve"> Dedicated /api/health endpoint verifying live JDBC database pool connectivity and reporting HTTP 200 JSON payload.</w:t>
       </w:r>
     </w:p>
     <w:p>
@@ -3244,7 +3308,7 @@
     </w:p>
     <w:p>
       <w:r>
-        <w:t>The application header displays the operator identity, active role, and live MySQL database connectivity status (DB: UP). The navigation bar provides one-click switching between transactional data entry and multi-table filtered retrieval.</w:t>
+        <w:t>The application header displays the operator identity, active role, and live MySQL database connectivity status (DB: UP). The navigation bar provides one-click switching between transactional data entry ('1. Enter Details') and multi-table filtered retrieval ('2. Retrieve / Search').</w:t>
       </w:r>
     </w:p>
     <w:p>
@@ -3319,7 +3383,7 @@
     </w:p>
     <w:p>
       <w:r>
-        <w:t>The Guest and Room management interface provides transactional forms to insert new entities into the normalized BCNF schema. The UI dynamically validates guest contact numbers and assigns room capacities and tariffs via raw JDBC PreparedStatements.</w:t>
+        <w:t>The Guest and Room management interface provides transactional forms to insert new entities into the normalized BCNF schema. The UI validates guest contact numbers and assigns room capacities and tariffs via raw JDBC PreparedStatements.</w:t>
       </w:r>
     </w:p>
     <w:p>
@@ -3394,7 +3458,7 @@
     </w:p>
     <w:p>
       <w:r>
-        <w:t>The Room and Booking forms allow front-desk receptionists to allocate available rooms to registered guests, specify booking channels (Walk-in, Online, Phone), and track confirmation status.</w:t>
+        <w:t>The Room and Booking forms allow front-desk receptionists to allocate available rooms to registered guests, specify booking channels (Walk-in, Online, Phone, Agent), and set initial reservation status.</w:t>
       </w:r>
     </w:p>
     <w:p>
@@ -3544,7 +3608,7 @@
     </w:p>
     <w:p>
       <w:r>
-        <w:t>The Billing module enables front-desk staff to generate itemized invoices linked via foreign key to active Booking_ID records, specifying billing amounts and tracking payment settlement.</w:t>
+        <w:t>The Billing module enables front-desk staff to generate invoices linked via foreign key to registered guests and active bookings, specifying billing amounts and tracking payment status (Unpaid / Paid).</w:t>
       </w:r>
     </w:p>
     <w:p>
@@ -3599,7 +3663,7 @@
           <w:color w:val="595959"/>
           <w:sz w:val="19"/>
         </w:rPr>
-        <w:t>Figure 8.5 — Billing Management: Add Bill form linking payments to guest and booking entities.</w:t>
+        <w:t>Figure 8.5 — Billing Management: Add Bill form linking payments to guest and booking entities with Unpaid status.</w:t>
       </w:r>
     </w:p>
     <w:p>
@@ -3619,7 +3683,7 @@
     </w:p>
     <w:p>
       <w:r>
-        <w:t>The diagnostic API endpoint (/api/health) verifies live end-to-end database connectivity, returning a JSON payload confirming status: UP and the target database hotel_management.</w:t>
+        <w:t>The diagnostic API endpoint (/api/health) verifies live end-to-end database connectivity through the Nginx reverse proxy, returning a JSON payload confirming status: UP and the target database hotel_management.</w:t>
       </w:r>
     </w:p>
     <w:p>
@@ -3674,7 +3738,7 @@
           <w:color w:val="595959"/>
           <w:sz w:val="19"/>
         </w:rPr>
-        <w:t>Figure 8.6 — Health Check Verification: JSON response from the Java backend confirming active MySQL connection over Port 80.</w:t>
+        <w:t>Figure 8.6 — Health Check Verification: JSON response from the Java backend confirming active MySQL connection over Port 80 via Nginx reverse proxy.</w:t>
       </w:r>
     </w:p>
     <w:p>
@@ -3714,7 +3778,7 @@
     </w:p>
     <w:p>
       <w:r>
-        <w:t>The EC2 console demonstrates that the Ubuntu virtual instance is active in the Running state with system status checks passing (2/2 checks), assigned a public IPv4 address (15.206.165.236), and residing in the ap-south-1 region.</w:t>
+        <w:t>The EC2 console demonstrates that the Ubuntu virtual instance (Instance ID: i-0601e61a67c089561, Name: hotel-management-server) is active in the Running state with status checks Initializing (captured during the initial instance boot sequence prior to 2/2 checks completion), assigned a public IPv4 address (15.206.165.236), and residing in the ap-south-1b Availability Zone.</w:t>
       </w:r>
     </w:p>
     <w:p>
@@ -3769,7 +3833,7 @@
           <w:color w:val="595959"/>
           <w:sz w:val="19"/>
         </w:rPr>
-        <w:t>Figure 9.1 — Amazon EC2 Management Console: Virtual server (t3.micro, i-0601e61a67c089561) in Running state with public IP 15.206.165.236.</w:t>
+        <w:t>Figure 9.1 — Amazon EC2 Management Console: Virtual server (t3.micro, i-0601e61a67c089561) in Running state (Status check: Initializing) with public IP 15.206.165.236.</w:t>
       </w:r>
     </w:p>
     <w:p>
@@ -3864,7 +3928,15 @@
     </w:p>
     <w:p>
       <w:r>
-        <w:t>The Security Group acts as an enterprise firewall. Inbound rules explicitly permit HTTP (TCP port 80) from all IPv4 sources (0.0.0.0/0) and SSH (TCP port 22) for administration.</w:t>
+        <w:t>The Security Group (launch-wizard-1, sg-05c58f0544aeeeb4d) acts as an enterprise firewall controlling ingress traffic to the host. As shown in Figure 9.3, the inbound rules specify:</w:t>
+        <w:br/>
+        <w:t>• HTTP (TCP Port 80, 0.0.0.0/0): Allows public web traffic to reach the Nginx reverse proxy.</w:t>
+        <w:br/>
+        <w:t>• SSH (TCP Port 22, 0.0.0.0/0): Allows administrative console access via EC2 Instance Connect.</w:t>
+        <w:br/>
+        <w:t>• MS SQL (TCP Port 1433, 0.0.0.0/0): An inactive firewall rule carried over from the initial launch wizard template selection before the Ubuntu AMI was finalized. Because no SQL Server process listens on port 1433, this rule represents an inert firewall entry that can be pruned in production hardening.</w:t>
+        <w:br/>
+        <w:t>Crucially, host ports 8080 (backend) and 3306 (MySQL) are completely omitted from the Security Group inbound rules, ensuring that public internet clients cannot directly connect to the backend or database microservices.</w:t>
       </w:r>
     </w:p>
     <w:p>
@@ -3919,7 +3991,7 @@
           <w:color w:val="595959"/>
           <w:sz w:val="19"/>
         </w:rPr>
-        <w:t>Figure 9.3 — Security Group Configuration: Inbound firewall rules enforcing HTTP (Port 80) and SSH (Port 22) access.</w:t>
+        <w:t>Figure 9.3 — Security Group Configuration: Inbound firewall rules showing HTTP (Port 80), SSH (Port 22), and template-inherited MS SQL (Port 1433).</w:t>
       </w:r>
     </w:p>
     <w:p>
@@ -3939,7 +4011,13 @@
     </w:p>
     <w:p>
       <w:r>
-        <w:t>Executing sudo docker compose ps within the EC2 terminal verifies that all three isolated container services (hotel_frontend, hotel_backend, and hotel_db) are running and healthy.</w:t>
+        <w:t>Executing sudo docker compose ps within the EC2 terminal verifies that all three container services are active and healthy:</w:t>
+        <w:br/>
+        <w:t>• hotel_frontend: Nginx web server bound to host port 80 (0.0.0.0:80-&gt;80/tcp).</w:t>
+        <w:br/>
+        <w:t>• hotel_backend: Java 17 REST API bound to host port 8080 (0.0.0.0:8080-&gt;8080/tcp) for local host diagnostics, shielded from the public internet by the Security Group.</w:t>
+        <w:br/>
+        <w:t>• hotel_db: MySQL 8.0 bound strictly to host loopback (127.0.0.1:3306-&gt;3306/tcp, healthy), completely preventing external remote connections.</w:t>
       </w:r>
     </w:p>
     <w:p>
@@ -3994,7 +4072,7 @@
           <w:color w:val="595959"/>
           <w:sz w:val="19"/>
         </w:rPr>
-        <w:t>Figure 9.4 — Docker Multi-Container Status: Active containers for Nginx (Port 80), Java backend (Port 8080), and MySQL 8.0 (healthy).</w:t>
+        <w:t>Figure 9.4 — Docker Multi-Container Status: Active containers for Nginx (Port 80), Java backend (Port 8080), and MySQL 8.0 (127.0.0.1:3306, healthy).</w:t>
       </w:r>
     </w:p>
     <w:p>
@@ -4014,7 +4092,10 @@
     </w:p>
     <w:p>
       <w:r>
-        <w:t>Terminal execution inside the MySQL container showing the result of SHOW TABLES; and verification of the 13 BCNF tables and 2 views within the hotel_management database schema.</w:t>
+        <w:t>Terminal execution inside the MySQL container showing the result of SHOW TABLES; and verification of all 13 BCNF tables and 2 SQL views within the hotel_management database schema.</w:t>
+        <w:br/>
+        <w:br/>
+        <w:t>Security Note on Development Credentials: In Figure 9.5, the parameter -prootpassword123 is supplied directly in the CLI command for immediate schema verification during testing. In an enterprise cloud production environment, best practices dictate abstracting credentials using AWS Secrets Manager or AWS Systems Manager Parameter Store, injecting credentials dynamically at runtime via IAM roles rather than passing them on the command line.</w:t>
       </w:r>
     </w:p>
     <w:p>
@@ -4164,7 +4245,7 @@
     </w:p>
     <w:p>
       <w:r>
-        <w:t>Terminal output of sudo docker compose logs backend showing the Java 17 application boot sequence, dynamic environment variable loading (DB_URL, PORT), and successful database handshake.</w:t>
+        <w:t>Terminal output of sudo docker compose logs --tail=25 backend showing the Java 17 application boot sequence, dynamic environment variable loading (DB_URL, PORT), and successful database handshake (✓ DB connection OK) followed by HTTP endpoint registration.</w:t>
       </w:r>
     </w:p>
     <w:p>
@@ -4239,7 +4320,19 @@
     </w:p>
     <w:p>
       <w:r>
-        <w:t>CloudWatch dashboard graphs illustrating real-time CPU Utilization (typically &lt; 21%), Network In/Out traffic bytes, and Disk Read/Write operations on the EC2 host during live application testing.</w:t>
+        <w:t>Figure 9.8 displays the Amazon EC2 integrated Monitoring dashboard, which captures real-time Amazon CloudWatch basic telemetry metrics for the hotel-management-server instance over a 1-hour window. The graphs illustrate:</w:t>
+        <w:br/>
+        <w:t>• CPU utilization (%): Operational peaks up to 21.23% during Docker image unpacking and build phases, stabilizing near ~0% at idle.</w:t>
+        <w:br/>
+        <w:t>• Network in (bytes): Ingress throughput peaking at 162.4 MB during base container image downloads (MySQL, Corretto, Alpine) and npm package resolution.</w:t>
+        <w:br/>
+        <w:t>• Network out (bytes): Egress throughput peaking at 916.5 KB during client HTTP web asset delivery.</w:t>
+        <w:br/>
+        <w:t>• Network packets in (count): Telemetry peaking at ~110.65K packets during build and package installation.</w:t>
+        <w:br/>
+        <w:t>• Network packets out (count): Telemetry peaking at ~3.81K packets for outbound HTTP responses.</w:t>
+        <w:br/>
+        <w:t>• CPU credit usage and CPU credit balance (count): Burstable T3 credit balance maintained at ~0.72 credits with credit usage peaking at 2.15 credits.</w:t>
       </w:r>
     </w:p>
     <w:p>
@@ -4294,7 +4387,7 @@
           <w:color w:val="595959"/>
           <w:sz w:val="19"/>
         </w:rPr>
-        <w:t>Figure 9.8 — Amazon CloudWatch Monitoring: Real-time CPU utilization (&lt; 21%), network throughput, and packet count telemetry for hotel-management-server.</w:t>
+        <w:t>Figure 9.8 — EC2 Integrated CloudWatch Telemetry: Real-time CPU utilization (peak 21.23%), network ingress/egress bytes, packet counts, and T3 CPU credit telemetry.</w:t>
       </w:r>
     </w:p>
     <w:p>
@@ -4426,7 +4519,7 @@
                 <w:b/>
                 <w:color w:val="FFFFFF"/>
               </w:rPr>
-              <w:t>Actual Result</w:t>
+              <w:t>Actual Result &amp; Photographic Evidence</w:t>
             </w:r>
           </w:p>
         </w:tc>
@@ -4480,7 +4573,7 @@
               <w:rPr>
                 <w:sz w:val="17"/>
               </w:rPr>
-              <w:t>Guest Mgmt</w:t>
+              <w:t>Guest Registration</w:t>
             </w:r>
           </w:p>
         </w:tc>
@@ -4497,7 +4590,7 @@
               <w:rPr>
                 <w:sz w:val="17"/>
               </w:rPr>
-              <w:t>Register a guest with valid attributes and 10-digit mobile (9876543210).</w:t>
+              <w:t>Submit Add Guest form with First Name, Last Name, DOB, Gender, and 10-digit mobile.</w:t>
             </w:r>
           </w:p>
         </w:tc>
@@ -4514,7 +4607,7 @@
               <w:rPr>
                 <w:sz w:val="17"/>
               </w:rPr>
-              <w:t>Guest inserted into MySQL; auto G_ID assigned; UI updates.</w:t>
+              <w:t>Guest inserted into MySQL; auto G_ID assigned; UI refreshes.</w:t>
             </w:r>
           </w:p>
         </w:tc>
@@ -4531,7 +4624,7 @@
               <w:rPr>
                 <w:sz w:val="17"/>
               </w:rPr>
-              <w:t>Record created; visible in guest list; HTTP 201 response.</w:t>
+              <w:t>Record created; visible in database and results view. (Verified in Figure 8.2 &amp; 8.4)</w:t>
             </w:r>
           </w:p>
         </w:tc>
@@ -4600,7 +4693,7 @@
               <w:rPr>
                 <w:sz w:val="17"/>
               </w:rPr>
-              <w:t>Attempt to register guest with invalid mobile (12345 or letters).</w:t>
+              <w:t>Attempt to register guest with invalid mobile (less than 10 digits).</w:t>
             </w:r>
           </w:p>
         </w:tc>
@@ -4616,7 +4709,7 @@
               <w:rPr>
                 <w:sz w:val="17"/>
               </w:rPr>
-              <w:t>Server CHECK constraint or client validation blocks insertion.</w:t>
+              <w:t>HTML5 regex constraint pattern prevents form submission.</w:t>
             </w:r>
           </w:p>
         </w:tc>
@@ -4632,7 +4725,7 @@
               <w:rPr>
                 <w:sz w:val="17"/>
               </w:rPr>
-              <w:t>Submission rejected; alert shown; no DB write.</w:t>
+              <w:t>Submission blocked by browser validation; no DB write occurred. (Verified in UI form constraints)</w:t>
             </w:r>
           </w:p>
         </w:tc>
@@ -4703,7 +4796,7 @@
               <w:rPr>
                 <w:sz w:val="17"/>
               </w:rPr>
-              <w:t>Toggle 'Available Only' room filter on Room Management page.</w:t>
+              <w:t>Submit Add Room form with Type: Single, Capacity: 1, Price: 1500, Availability: Available.</w:t>
             </w:r>
           </w:p>
         </w:tc>
@@ -4720,7 +4813,7 @@
               <w:rPr>
                 <w:sz w:val="17"/>
               </w:rPr>
-              <w:t>Queries /api/rooms?available=true; displays available rooms.</w:t>
+              <w:t>Room entity inserted into Room table; initial availability set.</w:t>
             </w:r>
           </w:p>
         </w:tc>
@@ -4737,7 +4830,7 @@
               <w:rPr>
                 <w:sz w:val="17"/>
               </w:rPr>
-              <w:t>Occupied rooms excluded; only available rooms rendered.</w:t>
+              <w:t>Room saved successfully; ready for reservation allocation. (Verified in Figure 8.2)</w:t>
             </w:r>
           </w:p>
         </w:tc>
@@ -4790,7 +4883,7 @@
               <w:rPr>
                 <w:sz w:val="17"/>
               </w:rPr>
-              <w:t>Booking Creation</w:t>
+              <w:t>Booking Allocation</w:t>
             </w:r>
           </w:p>
         </w:tc>
@@ -4806,7 +4899,7 @@
               <w:rPr>
                 <w:sz w:val="17"/>
               </w:rPr>
-              <w:t>Create booking with valid G_ID, available R_ID, and dates.</w:t>
+              <w:t>Create booking linking registered Guest and Room with Walk-in type and Confirmed status.</w:t>
             </w:r>
           </w:p>
         </w:tc>
@@ -4822,7 +4915,7 @@
               <w:rPr>
                 <w:sz w:val="17"/>
               </w:rPr>
-              <w:t>Booking_Record inserted; cost computed; room status Occupied.</w:t>
+              <w:t>Booking_Record inserted with temporal amount snapshot; linked via FK.</w:t>
             </w:r>
           </w:p>
         </w:tc>
@@ -4838,7 +4931,7 @@
               <w:rPr>
                 <w:sz w:val="17"/>
               </w:rPr>
-              <w:t>Booking registered; room status toggled to Occupied.</w:t>
+              <w:t>Booking created successfully; visible in Retrieve / Search table. (Verified in Figure 8.2 &amp; 8.4)</w:t>
             </w:r>
           </w:p>
         </w:tc>
@@ -4892,7 +4985,7 @@
               <w:rPr>
                 <w:sz w:val="17"/>
               </w:rPr>
-              <w:t>View Query</w:t>
+              <w:t>Relational View Query</w:t>
             </w:r>
           </w:p>
         </w:tc>
@@ -4909,7 +5002,7 @@
               <w:rPr>
                 <w:sz w:val="17"/>
               </w:rPr>
-              <w:t>Query /api/bookings?detailed to verify vw_booking_details view.</w:t>
+              <w:t>Execute search on '2. Retrieve / Search' tab against vw_booking_details with filter criteria.</w:t>
             </w:r>
           </w:p>
         </w:tc>
@@ -4926,7 +5019,7 @@
               <w:rPr>
                 <w:sz w:val="17"/>
               </w:rPr>
-              <w:t>Returns unified JSON records containing joined Guest, Room, Dates.</w:t>
+              <w:t>Unified JSON records returned joining Guest, Room, Dates, and Status.</w:t>
             </w:r>
           </w:p>
         </w:tc>
@@ -4943,7 +5036,7 @@
               <w:rPr>
                 <w:sz w:val="17"/>
               </w:rPr>
-              <w:t>View successfully queried; full joined metadata returned.</w:t>
+              <w:t>View queried live; results table renders joined records with SQL preview. (Verified in Figure 8.4)</w:t>
             </w:r>
           </w:p>
         </w:tc>
@@ -5012,7 +5105,7 @@
               <w:rPr>
                 <w:sz w:val="17"/>
               </w:rPr>
-              <w:t>Generate bill for active booking with method UPI and status Paid.</w:t>
+              <w:t>Submit Add Bill form linking Guest and active Booking with Amount and Status: Unpaid.</w:t>
             </w:r>
           </w:p>
         </w:tc>
@@ -5028,7 +5121,7 @@
               <w:rPr>
                 <w:sz w:val="17"/>
               </w:rPr>
-              <w:t>Record written to Bill table; linked via FK to Booking_ID.</w:t>
+              <w:t>Invoice record inserted into Bill table with foreign key linkage.</w:t>
             </w:r>
           </w:p>
         </w:tc>
@@ -5044,7 +5137,7 @@
               <w:rPr>
                 <w:sz w:val="17"/>
               </w:rPr>
-              <w:t>Invoice generated and displayed; amount matches.</w:t>
+              <w:t>Bill saved successfully with Unpaid status; linked to guest. (Verified in Figure 8.5)</w:t>
             </w:r>
           </w:p>
         </w:tc>
@@ -5098,7 +5191,7 @@
               <w:rPr>
                 <w:sz w:val="17"/>
               </w:rPr>
-              <w:t>Relational Delete</w:t>
+              <w:t>Diagnostic Health</w:t>
             </w:r>
           </w:p>
         </w:tc>
@@ -5115,7 +5208,7 @@
               <w:rPr>
                 <w:sz w:val="17"/>
               </w:rPr>
-              <w:t>Delete guest with dependent bookings to test ON DELETE CASCADE.</w:t>
+              <w:t>Send HTTP GET request to /api/health over public IP on Port 80.</w:t>
             </w:r>
           </w:p>
         </w:tc>
@@ -5132,7 +5225,7 @@
               <w:rPr>
                 <w:sz w:val="17"/>
               </w:rPr>
-              <w:t>Deletion cascades to remove associated Booking_Record and Bill.</w:t>
+              <w:t>JSON response returned: {"status":"UP","db":"hotel_management"}.</w:t>
             </w:r>
           </w:p>
         </w:tc>
@@ -5149,7 +5242,7 @@
               <w:rPr>
                 <w:sz w:val="17"/>
               </w:rPr>
-              <w:t>Foreign key cascade triggered; dependent bookings pruned.</w:t>
+              <w:t>HTTP 200 OK received with UP status confirming JDBC database pool. (Verified in Figure 8.6)</w:t>
             </w:r>
           </w:p>
         </w:tc>
@@ -5202,7 +5295,7 @@
               <w:rPr>
                 <w:sz w:val="17"/>
               </w:rPr>
-              <w:t>Diagnostic Health</w:t>
+              <w:t>Nginx Reverse Proxy</w:t>
             </w:r>
           </w:p>
         </w:tc>
@@ -5218,7 +5311,7 @@
               <w:rPr>
                 <w:sz w:val="17"/>
               </w:rPr>
-              <w:t>Send HTTP GET request to /api/health.</w:t>
+              <w:t>Access web application via public IPv4 (http://15.206.165.236/) without port specification.</w:t>
             </w:r>
           </w:p>
         </w:tc>
@@ -5234,7 +5327,7 @@
               <w:rPr>
                 <w:sz w:val="17"/>
               </w:rPr>
-              <w:t>JSON response {"status":"UP","db":"hotel_management"}.</w:t>
+              <w:t>Nginx routes port 80 to React frontend and proxies /api/* internally.</w:t>
             </w:r>
           </w:p>
         </w:tc>
@@ -5250,7 +5343,7 @@
               <w:rPr>
                 <w:sz w:val="17"/>
               </w:rPr>
-              <w:t>HTTP 200 OK received; connection verified.</w:t>
+              <w:t>Web application loads seamlessly; live health status shows DB: UP. (Verified in Figure 9.6)</w:t>
             </w:r>
           </w:p>
         </w:tc>
@@ -5304,7 +5397,7 @@
               <w:rPr>
                 <w:sz w:val="17"/>
               </w:rPr>
-              <w:t>Nginx Proxy</w:t>
+              <w:t>Container Orchestration</w:t>
             </w:r>
           </w:p>
         </w:tc>
@@ -5321,7 +5414,7 @@
               <w:rPr>
                 <w:sz w:val="17"/>
               </w:rPr>
-              <w:t>Access backend API externally via http://&lt;EC2-IP&gt;/api/guests on Port 80.</w:t>
+              <w:t>Execute sudo docker compose ps on EC2 host to verify container health.</w:t>
             </w:r>
           </w:p>
         </w:tc>
@@ -5338,7 +5431,7 @@
               <w:rPr>
                 <w:sz w:val="17"/>
               </w:rPr>
-              <w:t>Nginx proxies request to internal port 8080 without CORS.</w:t>
+              <w:t>Frontend, backend, and db containers active with db reported healthy.</w:t>
             </w:r>
           </w:p>
         </w:tc>
@@ -5355,7 +5448,7 @@
               <w:rPr>
                 <w:sz w:val="17"/>
               </w:rPr>
-              <w:t>Guests JSON returned without CORS errors.</w:t>
+              <w:t>All 3 containers active; db healthy; ports mapped correctly. (Verified in Figure 9.4)</w:t>
             </w:r>
           </w:p>
         </w:tc>
@@ -5408,7 +5501,7 @@
               <w:rPr>
                 <w:sz w:val="17"/>
               </w:rPr>
-              <w:t>SPA Fallback</w:t>
+              <w:t>Schema Verification</w:t>
             </w:r>
           </w:p>
         </w:tc>
@@ -5424,7 +5517,7 @@
               <w:rPr>
                 <w:sz w:val="17"/>
               </w:rPr>
-              <w:t>Refresh browser on a non-root route (e.g. /retrieve).</w:t>
+              <w:t>Execute SHOW TABLES; inside MySQL container via Docker CLI.</w:t>
             </w:r>
           </w:p>
         </w:tc>
@@ -5440,7 +5533,7 @@
               <w:rPr>
                 <w:sz w:val="17"/>
               </w:rPr>
-              <w:t>Nginx try_files rule serves index.html; React handles route.</w:t>
+              <w:t>13 BCNF relational tables and 2 SQL views listed in hotel_management schema.</w:t>
             </w:r>
           </w:p>
         </w:tc>
@@ -5456,7 +5549,7 @@
               <w:rPr>
                 <w:sz w:val="17"/>
               </w:rPr>
-              <w:t>Page refreshes correctly; React state preserved.</w:t>
+              <w:t>All 13 tables and 2 views verified present and correctly named. (Verified in Figure 9.5)</w:t>
             </w:r>
           </w:p>
         </w:tc>
@@ -5510,7 +5603,7 @@
               <w:rPr>
                 <w:sz w:val="17"/>
               </w:rPr>
-              <w:t>Container Resilience</w:t>
+              <w:t>Backend Boot &amp; Logs</w:t>
             </w:r>
           </w:p>
         </w:tc>
@@ -5527,7 +5620,7 @@
               <w:rPr>
                 <w:sz w:val="17"/>
               </w:rPr>
-              <w:t>Manually terminate backend container via docker stop hotel_backend.</w:t>
+              <w:t>Inspect backend runtime output via sudo docker compose logs backend.</w:t>
             </w:r>
           </w:p>
         </w:tc>
@@ -5544,7 +5637,7 @@
               <w:rPr>
                 <w:sz w:val="17"/>
               </w:rPr>
-              <w:t>Docker Compose restart policy (unless-stopped) restarts service.</w:t>
+              <w:t>Java 17 HTTP server boots on port 8080; DB connection established.</w:t>
             </w:r>
           </w:p>
         </w:tc>
@@ -5561,7 +5654,7 @@
               <w:rPr>
                 <w:sz w:val="17"/>
               </w:rPr>
-              <w:t>Container restarted within 5s; health recovers.</w:t>
+              <w:t>Logs confirm startup and '✓ DB connection OK' message. (Verified in Figure 9.7)</w:t>
             </w:r>
           </w:p>
         </w:tc>
@@ -5614,7 +5707,7 @@
               <w:rPr>
                 <w:sz w:val="17"/>
               </w:rPr>
-              <w:t>Database Persistence</w:t>
+              <w:t>Host Telemetry</w:t>
             </w:r>
           </w:p>
         </w:tc>
@@ -5630,7 +5723,7 @@
               <w:rPr>
                 <w:sz w:val="17"/>
               </w:rPr>
-              <w:t>Restart all containers via docker compose down &amp;&amp; docker compose up -d.</w:t>
+              <w:t>Monitor compute and network metrics in EC2 Console integrated CloudWatch monitoring.</w:t>
             </w:r>
           </w:p>
         </w:tc>
@@ -5646,7 +5739,7 @@
               <w:rPr>
                 <w:sz w:val="17"/>
               </w:rPr>
-              <w:t>MySQL data volume (db_data) retains all created entities.</w:t>
+              <w:t>Telemetry shows CPU utilization peak at 21.23% and network ingress of 162.4MB.</w:t>
             </w:r>
           </w:p>
         </w:tc>
@@ -5662,7 +5755,7 @@
               <w:rPr>
                 <w:sz w:val="17"/>
               </w:rPr>
-              <w:t>Data fully intact after full restart; volume verified.</w:t>
+              <w:t>Metrics captured in CloudWatch graphs confirming stable resource utilization. (Verified in Figure 9.8)</w:t>
             </w:r>
           </w:p>
         </w:tc>
@@ -5763,7 +5856,7 @@
         <w:t>Network &amp; Operational Security:</w:t>
       </w:r>
       <w:r>
-        <w:t xml:space="preserve"> Nginx reverse proxying isolates backend microservices and database ports from public exposure, eliminating CORS errors and centralizing HTTP routing on port 80.</w:t>
+        <w:t xml:space="preserve"> Nginx reverse proxying acts as the public entry point on Port 80, eliminating CORS errors and shielding backend microservices and database ports behind the AWS Security Group firewall.</w:t>
       </w:r>
     </w:p>
     <w:p>
@@ -5870,7 +5963,7 @@
         <w:rPr>
           <w:sz w:val="19"/>
         </w:rPr>
-        <w:t>[7] Docker Inc., 'Docker Compose File Version 3 Reference &amp; Multi-Stage Builds,' Docker Docs, 2024. [Online]. Available: https://docs.docker.com/compose/</w:t>
+        <w:t>[7] Docker Inc., 'Docker Compose Specification &amp; Multi-Stage Builds,' Docker Docs, 2024. [Online]. Available: https://docs.docker.com/compose/</w:t>
       </w:r>
     </w:p>
     <w:p>

</xml_diff>